<commit_message>
Modificacion de la memoria
Añado el logo del equipo
</commit_message>
<xml_diff>
--- a/Memoria proyecto integrador.docx
+++ b/Memoria proyecto integrador.docx
@@ -74,17 +74,6 @@
             </w:drawing>
           </w:r>
         </w:p>
-        <w:p>
-          <w:pPr>
-            <w:jc w:val="center"/>
-          </w:pPr>
-        </w:p>
-        <w:p>
-          <w:pPr>
-            <w:jc w:val="center"/>
-          </w:pPr>
-        </w:p>
-        <w:p/>
         <w:p/>
         <w:p>
           <w:pPr>
@@ -139,77 +128,99 @@
           <w:pPr>
             <w:jc w:val="center"/>
           </w:pPr>
+          <w:r>
+            <w:rPr>
+              <w:noProof/>
+            </w:rPr>
+            <w:drawing>
+              <wp:inline distT="0" distB="0" distL="0" distR="0" wp14:anchorId="5449D982" wp14:editId="5E20AE63">
+                <wp:extent cx="4578350" cy="2482850"/>
+                <wp:effectExtent l="0" t="0" r="0" b="0"/>
+                <wp:docPr id="940514820" name="Imagen 2"/>
+                <wp:cNvGraphicFramePr>
+                  <a:graphicFrameLocks xmlns:a="http://schemas.openxmlformats.org/drawingml/2006/main" noChangeAspect="1"/>
+                </wp:cNvGraphicFramePr>
+                <a:graphic xmlns:a="http://schemas.openxmlformats.org/drawingml/2006/main">
+                  <a:graphicData uri="http://schemas.openxmlformats.org/drawingml/2006/picture">
+                    <pic:pic xmlns:pic="http://schemas.openxmlformats.org/drawingml/2006/picture">
+                      <pic:nvPicPr>
+                        <pic:cNvPr id="940514820" name="Imagen 940514820"/>
+                        <pic:cNvPicPr/>
+                      </pic:nvPicPr>
+                      <pic:blipFill>
+                        <a:blip r:embed="rId9">
+                          <a:extLst>
+                            <a:ext uri="{28A0092B-C50C-407E-A947-70E740481C1C}">
+                              <a14:useLocalDpi xmlns:a14="http://schemas.microsoft.com/office/drawing/2010/main" val="0"/>
+                            </a:ext>
+                          </a:extLst>
+                        </a:blip>
+                        <a:stretch>
+                          <a:fillRect/>
+                        </a:stretch>
+                      </pic:blipFill>
+                      <pic:spPr>
+                        <a:xfrm>
+                          <a:off x="0" y="0"/>
+                          <a:ext cx="4578350" cy="2482850"/>
+                        </a:xfrm>
+                        <a:prstGeom prst="rect">
+                          <a:avLst/>
+                        </a:prstGeom>
+                      </pic:spPr>
+                    </pic:pic>
+                  </a:graphicData>
+                </a:graphic>
+              </wp:inline>
+            </w:drawing>
+          </w:r>
         </w:p>
+        <w:p/>
         <w:p>
           <w:pPr>
             <w:jc w:val="center"/>
-          </w:pPr>
-        </w:p>
-        <w:p>
-          <w:pPr>
-            <w:jc w:val="center"/>
+            <w:rPr>
+              <w:sz w:val="28"/>
+              <w:szCs w:val="24"/>
+            </w:rPr>
           </w:pPr>
           <w:r>
             <w:rPr>
-              <w:rFonts w:asciiTheme="majorHAnsi" w:hAnsiTheme="majorHAnsi"/>
-              <w:sz w:val="52"/>
-              <w:szCs w:val="72"/>
+              <w:sz w:val="28"/>
+              <w:szCs w:val="24"/>
             </w:rPr>
-            <w:t>[LOG</w:t>
-          </w:r>
-          <w:r>
-            <w:rPr>
-              <w:rFonts w:asciiTheme="majorHAnsi" w:hAnsiTheme="majorHAnsi"/>
-              <w:sz w:val="52"/>
-              <w:szCs w:val="72"/>
-            </w:rPr>
-            <w:t>O</w:t>
-          </w:r>
-          <w:r>
-            <w:rPr>
-              <w:rFonts w:asciiTheme="majorHAnsi" w:hAnsiTheme="majorHAnsi"/>
-              <w:sz w:val="52"/>
-              <w:szCs w:val="72"/>
-            </w:rPr>
-            <w:t>]</w:t>
-          </w:r>
-        </w:p>
-        <w:p>
-          <w:pPr>
-            <w:jc w:val="center"/>
-          </w:pPr>
-        </w:p>
-        <w:p>
-          <w:pPr>
-            <w:jc w:val="center"/>
-          </w:pPr>
-        </w:p>
-        <w:p>
-          <w:pPr>
-            <w:jc w:val="center"/>
-          </w:pPr>
-        </w:p>
-        <w:p>
-          <w:pPr>
-            <w:jc w:val="center"/>
-          </w:pPr>
-          <w:r>
             <w:t>Roberto Cantó Pedrera</w:t>
           </w:r>
         </w:p>
         <w:p>
           <w:pPr>
             <w:jc w:val="center"/>
+            <w:rPr>
+              <w:sz w:val="28"/>
+              <w:szCs w:val="24"/>
+            </w:rPr>
           </w:pPr>
           <w:r>
+            <w:rPr>
+              <w:sz w:val="28"/>
+              <w:szCs w:val="24"/>
+            </w:rPr>
             <w:t>Javier Garca Pablos</w:t>
           </w:r>
         </w:p>
         <w:p>
           <w:pPr>
             <w:jc w:val="center"/>
+            <w:rPr>
+              <w:sz w:val="28"/>
+              <w:szCs w:val="24"/>
+            </w:rPr>
           </w:pPr>
           <w:r>
+            <w:rPr>
+              <w:sz w:val="28"/>
+              <w:szCs w:val="24"/>
+            </w:rPr>
             <w:t>David Martínez del Río</w:t>
           </w:r>
         </w:p>
@@ -218,11 +229,17 @@
             <w:jc w:val="center"/>
           </w:pPr>
           <w:r>
+            <w:rPr>
+              <w:sz w:val="28"/>
+              <w:szCs w:val="24"/>
+            </w:rPr>
             <w:t>Diego Muñoz Avilés</w:t>
           </w:r>
           <w:r>
             <w:rPr>
               <w:rFonts w:ascii="Arial" w:hAnsi="Arial" w:cs="Arial"/>
+              <w:sz w:val="28"/>
+              <w:szCs w:val="24"/>
             </w:rPr>
             <w:t xml:space="preserve"> </w:t>
           </w:r>
@@ -2453,8 +2470,8 @@
     </w:p>
     <w:p/>
     <w:sectPr>
-      <w:headerReference w:type="default" r:id="rId9"/>
-      <w:footerReference w:type="default" r:id="rId10"/>
+      <w:headerReference w:type="default" r:id="rId10"/>
+      <w:footerReference w:type="default" r:id="rId11"/>
       <w:pgSz w:w="11906" w:h="16838"/>
       <w:pgMar w:top="1418" w:right="1418" w:bottom="1418" w:left="1418" w:header="709" w:footer="709" w:gutter="0"/>
       <w:pgNumType w:start="0"/>

</xml_diff>

<commit_message>
Actualizacion de la memoria
</commit_message>
<xml_diff>
--- a/Memoria proyecto integrador.docx
+++ b/Memoria proyecto integrador.docx
@@ -1465,8 +1465,40 @@
       <w:bookmarkEnd w:id="2"/>
     </w:p>
     <w:p>
-      <w:r>
-        <w:t>Para este apartado se recomienda una extensión de 1 a 2 páginas. Presentación del proyecto, contexto y detalles introductorios.</w:t>
+      <w:pPr>
+        <w:spacing w:before="100" w:beforeAutospacing="1" w:after="100" w:afterAutospacing="1" w:line="240" w:lineRule="auto"/>
+        <w:ind w:left="360"/>
+        <w:jc w:val="left"/>
+        <w:rPr>
+          <w:rFonts w:eastAsia="Times New Roman" w:cstheme="minorHAnsi"/>
+          <w:szCs w:val="24"/>
+        </w:rPr>
+      </w:pPr>
+      <w:bookmarkStart w:id="3" w:name="_Toc164530069"/>
+      <w:r>
+        <w:rPr>
+          <w:rFonts w:eastAsia="Times New Roman" w:cstheme="minorHAnsi"/>
+          <w:szCs w:val="24"/>
+        </w:rPr>
+        <w:t>Este proyecto integrador consiste en desarrollar una aplicación para gestionar las citas del taller de Edna Moda. Con esta aplicación se podrán administrar clientes, empleados, talleres, trajes y citas, pudiendo crear, consultar, modificar y eliminar información.</w:t>
+      </w:r>
+    </w:p>
+    <w:p>
+      <w:pPr>
+        <w:spacing w:before="100" w:beforeAutospacing="1" w:after="100" w:afterAutospacing="1" w:line="240" w:lineRule="auto"/>
+        <w:ind w:left="360"/>
+        <w:jc w:val="left"/>
+        <w:rPr>
+          <w:rFonts w:eastAsia="Times New Roman" w:cstheme="minorHAnsi"/>
+          <w:szCs w:val="24"/>
+        </w:rPr>
+      </w:pPr>
+      <w:r>
+        <w:rPr>
+          <w:rFonts w:eastAsia="Times New Roman" w:cstheme="minorHAnsi"/>
+          <w:szCs w:val="24"/>
+        </w:rPr>
+        <w:t>En el proyecto se aplican conocimientos de Programación, Bases de Datos y Entornos de Desarrollo, trabajando tanto el diseño de la base de datos como el desarrollo de la aplicación y la organización del trabajo en equipo.</w:t>
       </w:r>
     </w:p>
     <w:p>
@@ -1477,7 +1509,6 @@
           <w:numId w:val="1"/>
         </w:numPr>
       </w:pPr>
-      <w:bookmarkStart w:id="3" w:name="_Toc164530069"/>
       <w:r>
         <w:t>Objetivos</w:t>
       </w:r>
@@ -1746,7 +1777,6 @@
           <w:sz w:val="28"/>
           <w:szCs w:val="28"/>
         </w:rPr>
-        <w:lastRenderedPageBreak/>
         <w:t>Programación</w:t>
       </w:r>
     </w:p>
@@ -1998,25 +2028,6 @@
         </w:rPr>
         <w:t>Estos objetivos permiten organizar el desarrollo del proyecto y garantizar la calidad del software.</w:t>
       </w:r>
-    </w:p>
-    <w:p>
-      <w:pPr>
-        <w:rPr>
-          <w:color w:val="000000" w:themeColor="text1"/>
-          <w:szCs w:val="24"/>
-        </w:rPr>
-      </w:pPr>
-    </w:p>
-    <w:p>
-      <w:pPr>
-        <w:rPr>
-          <w:b/>
-          <w:bCs/>
-          <w:color w:val="000000" w:themeColor="text1"/>
-          <w:sz w:val="28"/>
-          <w:szCs w:val="28"/>
-        </w:rPr>
-      </w:pPr>
     </w:p>
     <w:p>
       <w:pPr>
@@ -2039,6 +2050,7 @@
       </w:pPr>
       <w:bookmarkStart w:id="4" w:name="_Toc164530070"/>
       <w:r>
+        <w:lastRenderedPageBreak/>
         <w:t>Tecnologías utilizadas</w:t>
       </w:r>
       <w:bookmarkEnd w:id="4"/>
@@ -2070,7 +2082,6 @@
       </w:pPr>
       <w:bookmarkStart w:id="5" w:name="_Toc164530071"/>
       <w:r>
-        <w:lastRenderedPageBreak/>
         <w:t>Desarrollo e implementación</w:t>
       </w:r>
       <w:bookmarkEnd w:id="5"/>
@@ -2270,6 +2281,7 @@
         </w:rPr>
       </w:pPr>
       <w:r>
+        <w:lastRenderedPageBreak/>
         <w:br w:type="page"/>
       </w:r>
     </w:p>
@@ -3501,7 +3513,7 @@
     <w:lsdException w:name="E-mail Signature" w:semiHidden="1" w:unhideWhenUsed="1"/>
     <w:lsdException w:name="HTML Top of Form" w:semiHidden="1" w:unhideWhenUsed="1"/>
     <w:lsdException w:name="HTML Bottom of Form" w:semiHidden="1" w:unhideWhenUsed="1"/>
-    <w:lsdException w:name="Normal (Web)" w:semiHidden="1" w:uiPriority="0" w:unhideWhenUsed="1"/>
+    <w:lsdException w:name="Normal (Web)" w:semiHidden="1" w:unhideWhenUsed="1"/>
     <w:lsdException w:name="HTML Acronym" w:semiHidden="1" w:unhideWhenUsed="1"/>
     <w:lsdException w:name="HTML Address" w:semiHidden="1" w:unhideWhenUsed="1"/>
     <w:lsdException w:name="HTML Cite" w:semiHidden="1" w:unhideWhenUsed="1"/>
@@ -3891,6 +3903,7 @@
   <w:style w:type="paragraph" w:styleId="NormalWeb">
     <w:name w:val="Normal (Web)"/>
     <w:basedOn w:val="Normal"/>
+    <w:uiPriority w:val="99"/>
     <w:rsid w:val="00AC38AD"/>
     <w:pPr>
       <w:spacing w:before="100" w:beforeAutospacing="1" w:after="100" w:afterAutospacing="1" w:line="240" w:lineRule="auto"/>
@@ -4011,6 +4024,17 @@
       <w:szCs w:val="26"/>
       <w:lang w:eastAsia="es-ES"/>
     </w:rPr>
+  </w:style>
+  <w:style w:type="paragraph" w:styleId="Prrafodelista">
+    <w:name w:val="List Paragraph"/>
+    <w:basedOn w:val="Normal"/>
+    <w:uiPriority w:val="34"/>
+    <w:qFormat/>
+    <w:rsid w:val="0091327F"/>
+    <w:pPr>
+      <w:ind w:left="720"/>
+      <w:contextualSpacing/>
+    </w:pPr>
   </w:style>
 </w:styles>
 </file>

</xml_diff>